<commit_message>
test(corpus): tab leader labels apart from their tabs, and a long word to hyphenate
From the review of #248:

- E-tab-leader put each case's label before its tab on the same line;
  the labels end between 193 and 249 pt in Calibri 11 pt, past the stops
  at 216 pt, so most tabs went to the next default stop with no leader.
  Each label is now a paragraph of its own, and the sample paragraph
  starts with its tab at the left margin.
- E-spacing-condensed: condensed by 6 pt, most letters at 11 pt take no
  room, so the sample never reached the end of its narrow line. The
  soft hyphen cases now hold one word of 150 letters with a soft hyphen
  after every syllable, wider than the line even condensed, at 24 pt for
  -6 pt.
- The tests check that E-tab-leader's labels hold no tab, the long word,
  and the soft hyphens, narrow indent and three spaces that the labels
  of E-underline and E-highlight name.

Co-Authored-By: Claude Opus 5.5 <noreply@anthropic.com>
</commit_message>
<xml_diff>
--- a/tests/corpus/word-rules/E-spacing-condensed.docx
+++ b/tests/corpus/word-rules/E-spacing-condensed.docx
@@ -7,7 +7,7 @@
         <w:ind w:right="6026"/>
       </w:pPr>
       <w:r>
-        <w:t xml:space="preserve">Case 01: condensed by 3 pt, a narrow paragraph that breaks at soft hyphens: </w:t>
+        <w:t xml:space="preserve">Case 01: condensed by 3 pt, a narrow paragraph of one long word with soft hyphens: </w:t>
       </w:r>
       <w:r>
         <w:rPr>
@@ -25,55 +25,121 @@
         <w:softHyphen/>
         <w:t xml:space="preserve">i</w:t>
         <w:softHyphen/>
-        <w:t xml:space="preserve">ly ex</w:t>
-        <w:softHyphen/>
-        <w:t xml:space="preserve">tra</w:t>
-        <w:softHyphen/>
-        <w:t xml:space="preserve">or</w:t>
-        <w:softHyphen/>
-        <w:t xml:space="preserve">di</w:t>
-        <w:softHyphen/>
-        <w:t xml:space="preserve">nar</w:t>
-        <w:softHyphen/>
-        <w:t xml:space="preserve">i</w:t>
-        <w:softHyphen/>
-        <w:t xml:space="preserve">ly ex</w:t>
-        <w:softHyphen/>
-        <w:t xml:space="preserve">tra</w:t>
-        <w:softHyphen/>
-        <w:t xml:space="preserve">or</w:t>
-        <w:softHyphen/>
-        <w:t xml:space="preserve">di</w:t>
-        <w:softHyphen/>
-        <w:t xml:space="preserve">nar</w:t>
-        <w:softHyphen/>
-        <w:t xml:space="preserve">i</w:t>
-        <w:softHyphen/>
-        <w:t xml:space="preserve">ly ex</w:t>
-        <w:softHyphen/>
-        <w:t xml:space="preserve">tra</w:t>
-        <w:softHyphen/>
-        <w:t xml:space="preserve">or</w:t>
-        <w:softHyphen/>
-        <w:t xml:space="preserve">di</w:t>
-        <w:softHyphen/>
-        <w:t xml:space="preserve">nar</w:t>
-        <w:softHyphen/>
-        <w:t xml:space="preserve">i</w:t>
-        <w:softHyphen/>
-        <w:t xml:space="preserve">ly ex</w:t>
-        <w:softHyphen/>
-        <w:t xml:space="preserve">tra</w:t>
-        <w:softHyphen/>
-        <w:t xml:space="preserve">or</w:t>
-        <w:softHyphen/>
-        <w:t xml:space="preserve">di</w:t>
-        <w:softHyphen/>
-        <w:t xml:space="preserve">nar</w:t>
-        <w:softHyphen/>
-        <w:t xml:space="preserve">i</w:t>
-        <w:softHyphen/>
-        <w:t xml:space="preserve">ly ex</w:t>
+        <w:t xml:space="preserve">ly</w:t>
+        <w:softHyphen/>
+        <w:t xml:space="preserve">ex</w:t>
+        <w:softHyphen/>
+        <w:t xml:space="preserve">tra</w:t>
+        <w:softHyphen/>
+        <w:t xml:space="preserve">or</w:t>
+        <w:softHyphen/>
+        <w:t xml:space="preserve">di</w:t>
+        <w:softHyphen/>
+        <w:t xml:space="preserve">nar</w:t>
+        <w:softHyphen/>
+        <w:t xml:space="preserve">i</w:t>
+        <w:softHyphen/>
+        <w:t xml:space="preserve">ly</w:t>
+        <w:softHyphen/>
+        <w:t xml:space="preserve">ex</w:t>
+        <w:softHyphen/>
+        <w:t xml:space="preserve">tra</w:t>
+        <w:softHyphen/>
+        <w:t xml:space="preserve">or</w:t>
+        <w:softHyphen/>
+        <w:t xml:space="preserve">di</w:t>
+        <w:softHyphen/>
+        <w:t xml:space="preserve">nar</w:t>
+        <w:softHyphen/>
+        <w:t xml:space="preserve">i</w:t>
+        <w:softHyphen/>
+        <w:t xml:space="preserve">ly</w:t>
+        <w:softHyphen/>
+        <w:t xml:space="preserve">ex</w:t>
+        <w:softHyphen/>
+        <w:t xml:space="preserve">tra</w:t>
+        <w:softHyphen/>
+        <w:t xml:space="preserve">or</w:t>
+        <w:softHyphen/>
+        <w:t xml:space="preserve">di</w:t>
+        <w:softHyphen/>
+        <w:t xml:space="preserve">nar</w:t>
+        <w:softHyphen/>
+        <w:t xml:space="preserve">i</w:t>
+        <w:softHyphen/>
+        <w:t xml:space="preserve">ly</w:t>
+        <w:softHyphen/>
+        <w:t xml:space="preserve">ex</w:t>
+        <w:softHyphen/>
+        <w:t xml:space="preserve">tra</w:t>
+        <w:softHyphen/>
+        <w:t xml:space="preserve">or</w:t>
+        <w:softHyphen/>
+        <w:t xml:space="preserve">di</w:t>
+        <w:softHyphen/>
+        <w:t xml:space="preserve">nar</w:t>
+        <w:softHyphen/>
+        <w:t xml:space="preserve">i</w:t>
+        <w:softHyphen/>
+        <w:t xml:space="preserve">ly</w:t>
+        <w:softHyphen/>
+        <w:t xml:space="preserve">ex</w:t>
+        <w:softHyphen/>
+        <w:t xml:space="preserve">tra</w:t>
+        <w:softHyphen/>
+        <w:t xml:space="preserve">or</w:t>
+        <w:softHyphen/>
+        <w:t xml:space="preserve">di</w:t>
+        <w:softHyphen/>
+        <w:t xml:space="preserve">nar</w:t>
+        <w:softHyphen/>
+        <w:t xml:space="preserve">i</w:t>
+        <w:softHyphen/>
+        <w:t xml:space="preserve">ly</w:t>
+        <w:softHyphen/>
+        <w:t xml:space="preserve">ex</w:t>
+        <w:softHyphen/>
+        <w:t xml:space="preserve">tra</w:t>
+        <w:softHyphen/>
+        <w:t xml:space="preserve">or</w:t>
+        <w:softHyphen/>
+        <w:t xml:space="preserve">di</w:t>
+        <w:softHyphen/>
+        <w:t xml:space="preserve">nar</w:t>
+        <w:softHyphen/>
+        <w:t xml:space="preserve">i</w:t>
+        <w:softHyphen/>
+        <w:t xml:space="preserve">ly</w:t>
+        <w:softHyphen/>
+        <w:t xml:space="preserve">ex</w:t>
+        <w:softHyphen/>
+        <w:t xml:space="preserve">tra</w:t>
+        <w:softHyphen/>
+        <w:t xml:space="preserve">or</w:t>
+        <w:softHyphen/>
+        <w:t xml:space="preserve">di</w:t>
+        <w:softHyphen/>
+        <w:t xml:space="preserve">nar</w:t>
+        <w:softHyphen/>
+        <w:t xml:space="preserve">i</w:t>
+        <w:softHyphen/>
+        <w:t xml:space="preserve">ly</w:t>
+        <w:softHyphen/>
+        <w:t xml:space="preserve">ex</w:t>
+        <w:softHyphen/>
+        <w:t xml:space="preserve">tra</w:t>
+        <w:softHyphen/>
+        <w:t xml:space="preserve">or</w:t>
+        <w:softHyphen/>
+        <w:t xml:space="preserve">di</w:t>
+        <w:softHyphen/>
+        <w:t xml:space="preserve">nar</w:t>
+        <w:softHyphen/>
+        <w:t xml:space="preserve">i</w:t>
+        <w:softHyphen/>
+        <w:t xml:space="preserve">ly</w:t>
+        <w:softHyphen/>
+        <w:t xml:space="preserve">ex</w:t>
         <w:softHyphen/>
         <w:t xml:space="preserve">tra</w:t>
         <w:softHyphen/>
@@ -145,73 +211,141 @@
         <w:ind w:right="6026"/>
       </w:pPr>
       <w:r>
-        <w:t xml:space="preserve">Case 06: condensed by 6 pt, a narrow paragraph that breaks at soft hyphens: </w:t>
+        <w:t xml:space="preserve">Case 06: condensed by 6 pt, 24 pt text, a narrow paragraph of one long word with soft hyphens: </w:t>
       </w:r>
       <w:r>
         <w:rPr>
           <w:spacing w:val="-120"/>
-        </w:rPr>
-        <w:t xml:space="preserve">ex</w:t>
-        <w:softHyphen/>
-        <w:t xml:space="preserve">tra</w:t>
-        <w:softHyphen/>
-        <w:t xml:space="preserve">or</w:t>
-        <w:softHyphen/>
-        <w:t xml:space="preserve">di</w:t>
-        <w:softHyphen/>
-        <w:t xml:space="preserve">nar</w:t>
-        <w:softHyphen/>
-        <w:t xml:space="preserve">i</w:t>
-        <w:softHyphen/>
-        <w:t xml:space="preserve">ly ex</w:t>
-        <w:softHyphen/>
-        <w:t xml:space="preserve">tra</w:t>
-        <w:softHyphen/>
-        <w:t xml:space="preserve">or</w:t>
-        <w:softHyphen/>
-        <w:t xml:space="preserve">di</w:t>
-        <w:softHyphen/>
-        <w:t xml:space="preserve">nar</w:t>
-        <w:softHyphen/>
-        <w:t xml:space="preserve">i</w:t>
-        <w:softHyphen/>
-        <w:t xml:space="preserve">ly ex</w:t>
-        <w:softHyphen/>
-        <w:t xml:space="preserve">tra</w:t>
-        <w:softHyphen/>
-        <w:t xml:space="preserve">or</w:t>
-        <w:softHyphen/>
-        <w:t xml:space="preserve">di</w:t>
-        <w:softHyphen/>
-        <w:t xml:space="preserve">nar</w:t>
-        <w:softHyphen/>
-        <w:t xml:space="preserve">i</w:t>
-        <w:softHyphen/>
-        <w:t xml:space="preserve">ly ex</w:t>
-        <w:softHyphen/>
-        <w:t xml:space="preserve">tra</w:t>
-        <w:softHyphen/>
-        <w:t xml:space="preserve">or</w:t>
-        <w:softHyphen/>
-        <w:t xml:space="preserve">di</w:t>
-        <w:softHyphen/>
-        <w:t xml:space="preserve">nar</w:t>
-        <w:softHyphen/>
-        <w:t xml:space="preserve">i</w:t>
-        <w:softHyphen/>
-        <w:t xml:space="preserve">ly ex</w:t>
-        <w:softHyphen/>
-        <w:t xml:space="preserve">tra</w:t>
-        <w:softHyphen/>
-        <w:t xml:space="preserve">or</w:t>
-        <w:softHyphen/>
-        <w:t xml:space="preserve">di</w:t>
-        <w:softHyphen/>
-        <w:t xml:space="preserve">nar</w:t>
-        <w:softHyphen/>
-        <w:t xml:space="preserve">i</w:t>
-        <w:softHyphen/>
-        <w:t xml:space="preserve">ly ex</w:t>
+          <w:sz w:val="48"/>
+          <w:szCs w:val="48"/>
+        </w:rPr>
+        <w:t xml:space="preserve">ex</w:t>
+        <w:softHyphen/>
+        <w:t xml:space="preserve">tra</w:t>
+        <w:softHyphen/>
+        <w:t xml:space="preserve">or</w:t>
+        <w:softHyphen/>
+        <w:t xml:space="preserve">di</w:t>
+        <w:softHyphen/>
+        <w:t xml:space="preserve">nar</w:t>
+        <w:softHyphen/>
+        <w:t xml:space="preserve">i</w:t>
+        <w:softHyphen/>
+        <w:t xml:space="preserve">ly</w:t>
+        <w:softHyphen/>
+        <w:t xml:space="preserve">ex</w:t>
+        <w:softHyphen/>
+        <w:t xml:space="preserve">tra</w:t>
+        <w:softHyphen/>
+        <w:t xml:space="preserve">or</w:t>
+        <w:softHyphen/>
+        <w:t xml:space="preserve">di</w:t>
+        <w:softHyphen/>
+        <w:t xml:space="preserve">nar</w:t>
+        <w:softHyphen/>
+        <w:t xml:space="preserve">i</w:t>
+        <w:softHyphen/>
+        <w:t xml:space="preserve">ly</w:t>
+        <w:softHyphen/>
+        <w:t xml:space="preserve">ex</w:t>
+        <w:softHyphen/>
+        <w:t xml:space="preserve">tra</w:t>
+        <w:softHyphen/>
+        <w:t xml:space="preserve">or</w:t>
+        <w:softHyphen/>
+        <w:t xml:space="preserve">di</w:t>
+        <w:softHyphen/>
+        <w:t xml:space="preserve">nar</w:t>
+        <w:softHyphen/>
+        <w:t xml:space="preserve">i</w:t>
+        <w:softHyphen/>
+        <w:t xml:space="preserve">ly</w:t>
+        <w:softHyphen/>
+        <w:t xml:space="preserve">ex</w:t>
+        <w:softHyphen/>
+        <w:t xml:space="preserve">tra</w:t>
+        <w:softHyphen/>
+        <w:t xml:space="preserve">or</w:t>
+        <w:softHyphen/>
+        <w:t xml:space="preserve">di</w:t>
+        <w:softHyphen/>
+        <w:t xml:space="preserve">nar</w:t>
+        <w:softHyphen/>
+        <w:t xml:space="preserve">i</w:t>
+        <w:softHyphen/>
+        <w:t xml:space="preserve">ly</w:t>
+        <w:softHyphen/>
+        <w:t xml:space="preserve">ex</w:t>
+        <w:softHyphen/>
+        <w:t xml:space="preserve">tra</w:t>
+        <w:softHyphen/>
+        <w:t xml:space="preserve">or</w:t>
+        <w:softHyphen/>
+        <w:t xml:space="preserve">di</w:t>
+        <w:softHyphen/>
+        <w:t xml:space="preserve">nar</w:t>
+        <w:softHyphen/>
+        <w:t xml:space="preserve">i</w:t>
+        <w:softHyphen/>
+        <w:t xml:space="preserve">ly</w:t>
+        <w:softHyphen/>
+        <w:t xml:space="preserve">ex</w:t>
+        <w:softHyphen/>
+        <w:t xml:space="preserve">tra</w:t>
+        <w:softHyphen/>
+        <w:t xml:space="preserve">or</w:t>
+        <w:softHyphen/>
+        <w:t xml:space="preserve">di</w:t>
+        <w:softHyphen/>
+        <w:t xml:space="preserve">nar</w:t>
+        <w:softHyphen/>
+        <w:t xml:space="preserve">i</w:t>
+        <w:softHyphen/>
+        <w:t xml:space="preserve">ly</w:t>
+        <w:softHyphen/>
+        <w:t xml:space="preserve">ex</w:t>
+        <w:softHyphen/>
+        <w:t xml:space="preserve">tra</w:t>
+        <w:softHyphen/>
+        <w:t xml:space="preserve">or</w:t>
+        <w:softHyphen/>
+        <w:t xml:space="preserve">di</w:t>
+        <w:softHyphen/>
+        <w:t xml:space="preserve">nar</w:t>
+        <w:softHyphen/>
+        <w:t xml:space="preserve">i</w:t>
+        <w:softHyphen/>
+        <w:t xml:space="preserve">ly</w:t>
+        <w:softHyphen/>
+        <w:t xml:space="preserve">ex</w:t>
+        <w:softHyphen/>
+        <w:t xml:space="preserve">tra</w:t>
+        <w:softHyphen/>
+        <w:t xml:space="preserve">or</w:t>
+        <w:softHyphen/>
+        <w:t xml:space="preserve">di</w:t>
+        <w:softHyphen/>
+        <w:t xml:space="preserve">nar</w:t>
+        <w:softHyphen/>
+        <w:t xml:space="preserve">i</w:t>
+        <w:softHyphen/>
+        <w:t xml:space="preserve">ly</w:t>
+        <w:softHyphen/>
+        <w:t xml:space="preserve">ex</w:t>
+        <w:softHyphen/>
+        <w:t xml:space="preserve">tra</w:t>
+        <w:softHyphen/>
+        <w:t xml:space="preserve">or</w:t>
+        <w:softHyphen/>
+        <w:t xml:space="preserve">di</w:t>
+        <w:softHyphen/>
+        <w:t xml:space="preserve">nar</w:t>
+        <w:softHyphen/>
+        <w:t xml:space="preserve">i</w:t>
+        <w:softHyphen/>
+        <w:t xml:space="preserve">ly</w:t>
+        <w:softHyphen/>
+        <w:t xml:space="preserve">ex</w:t>
         <w:softHyphen/>
         <w:t xml:space="preserve">tra</w:t>
         <w:softHyphen/>

</xml_diff>